<commit_message>
Finished 1.2.1 and started 1.2.2
</commit_message>
<xml_diff>
--- a/Part1.docx
+++ b/Part1.docx
@@ -20,7 +20,13 @@
     </w:p>
     <w:p>
       <w:r>
-        <w:t>False, g is from T1 to T2</w:t>
+        <w:rPr>
+          <w:color w:val="EE0000"/>
+        </w:rPr>
+        <w:t>False</w:t>
+      </w:r>
+      <w:r>
+        <w:t>, g is from T1 to T2</w:t>
       </w:r>
       <w:r>
         <w:t xml:space="preserve"> in the </w:t>
@@ -49,7 +55,13 @@
     </w:p>
     <w:p>
       <w:r>
-        <w:t>False, f type is from T1*T2, meaning the first variable will be of type T1.</w:t>
+        <w:rPr>
+          <w:color w:val="EE0000"/>
+        </w:rPr>
+        <w:t>False</w:t>
+      </w:r>
+      <w:r>
+        <w:t>, f type is from T1*T2, meaning the first variable will be of type T1.</w:t>
       </w:r>
     </w:p>
     <w:p>
@@ -66,20 +78,1024 @@
       </w:r>
     </w:p>
     <w:p>
-      <w:r>
+      <w:pPr>
+        <w:rPr>
+          <w:color w:val="4EA72E" w:themeColor="accent6"/>
+        </w:rPr>
+      </w:pPr>
+      <w:r>
+        <w:rPr>
+          <w:color w:val="4EA72E" w:themeColor="accent6"/>
+        </w:rPr>
         <w:t>True</w:t>
       </w:r>
     </w:p>
+    <w:p/>
+    <w:p/>
+    <w:p/>
+    <w:p/>
+    <w:p/>
+    <w:p/>
+    <w:p/>
+    <w:p/>
+    <w:p/>
+    <w:p/>
+    <w:p/>
     <w:p/>
     <w:p>
       <w:pPr>
         <w:pStyle w:val="Heading2"/>
       </w:pPr>
       <w:r>
+        <w:lastRenderedPageBreak/>
         <w:t>Question 1.2</w:t>
       </w:r>
-    </w:p>
-    <w:p/>
+      <w:r>
+        <w:t>.1</w:t>
+      </w:r>
+    </w:p>
+    <w:p>
+      <w:r>
+        <w:rPr>
+          <w:b/>
+          <w:bCs/>
+        </w:rPr>
+        <w:t>Pool</w:t>
+      </w:r>
+      <w:r>
+        <w:t>:</w:t>
+      </w:r>
+    </w:p>
+    <w:tbl>
+      <w:tblPr>
+        <w:tblStyle w:val="TableGrid"/>
+        <w:tblW w:w="0" w:type="auto"/>
+        <w:tblLook w:val="04A0" w:firstRow="1" w:lastRow="0" w:firstColumn="1" w:lastColumn="0" w:noHBand="0" w:noVBand="1"/>
+      </w:tblPr>
+      <w:tblGrid>
+        <w:gridCol w:w="7465"/>
+        <w:gridCol w:w="1885"/>
+      </w:tblGrid>
+      <w:tr>
+        <w:tc>
+          <w:tcPr>
+            <w:tcW w:w="7465" w:type="dxa"/>
+            <w:shd w:val="clear" w:color="auto" w:fill="E8E8E8" w:themeFill="background2"/>
+          </w:tcPr>
+          <w:p>
+            <w:pPr>
+              <w:rPr>
+                <w:b/>
+                <w:bCs/>
+              </w:rPr>
+            </w:pPr>
+            <w:r>
+              <w:rPr>
+                <w:b/>
+                <w:bCs/>
+              </w:rPr>
+              <w:t>Sub-expression</w:t>
+            </w:r>
+          </w:p>
+        </w:tc>
+        <w:tc>
+          <w:tcPr>
+            <w:tcW w:w="1885" w:type="dxa"/>
+            <w:shd w:val="clear" w:color="auto" w:fill="E8E8E8" w:themeFill="background2"/>
+          </w:tcPr>
+          <w:p>
+            <w:pPr>
+              <w:rPr>
+                <w:b/>
+                <w:bCs/>
+              </w:rPr>
+            </w:pPr>
+            <w:r>
+              <w:rPr>
+                <w:b/>
+                <w:bCs/>
+              </w:rPr>
+              <w:t>type</w:t>
+            </w:r>
+          </w:p>
+        </w:tc>
+      </w:tr>
+      <w:tr>
+        <w:tc>
+          <w:tcPr>
+            <w:tcW w:w="7465" w:type="dxa"/>
+          </w:tcPr>
+          <w:p>
+            <w:r>
+              <w:t>(lambda (f1 g1 x1 y1) (f1 (g1 y1 x1) (g1 x1 y1)))</w:t>
+            </w:r>
+          </w:p>
+          <w:p/>
+        </w:tc>
+        <w:tc>
+          <w:tcPr>
+            <w:tcW w:w="1885" w:type="dxa"/>
+          </w:tcPr>
+          <w:p>
+            <w:r>
+              <w:t>T1</w:t>
+            </w:r>
+          </w:p>
+        </w:tc>
+      </w:tr>
+      <w:tr>
+        <w:tc>
+          <w:tcPr>
+            <w:tcW w:w="7465" w:type="dxa"/>
+          </w:tcPr>
+          <w:p>
+            <w:r>
+              <w:t>(f1 (g1 y1 x1) (g1 x1 y1))</w:t>
+            </w:r>
+          </w:p>
+        </w:tc>
+        <w:tc>
+          <w:tcPr>
+            <w:tcW w:w="1885" w:type="dxa"/>
+          </w:tcPr>
+          <w:p>
+            <w:r>
+              <w:t>T2</w:t>
+            </w:r>
+          </w:p>
+        </w:tc>
+      </w:tr>
+      <w:tr>
+        <w:tc>
+          <w:tcPr>
+            <w:tcW w:w="7465" w:type="dxa"/>
+          </w:tcPr>
+          <w:p>
+            <w:r>
+              <w:t>f1</w:t>
+            </w:r>
+          </w:p>
+        </w:tc>
+        <w:tc>
+          <w:tcPr>
+            <w:tcW w:w="1885" w:type="dxa"/>
+          </w:tcPr>
+          <w:p>
+            <w:proofErr w:type="spellStart"/>
+            <w:r>
+              <w:t>Tf</w:t>
+            </w:r>
+            <w:proofErr w:type="spellEnd"/>
+          </w:p>
+        </w:tc>
+      </w:tr>
+      <w:tr>
+        <w:tc>
+          <w:tcPr>
+            <w:tcW w:w="7465" w:type="dxa"/>
+          </w:tcPr>
+          <w:p>
+            <w:r>
+              <w:t>(g1 y1 x1)</w:t>
+            </w:r>
+          </w:p>
+        </w:tc>
+        <w:tc>
+          <w:tcPr>
+            <w:tcW w:w="1885" w:type="dxa"/>
+          </w:tcPr>
+          <w:p>
+            <w:r>
+              <w:t>T3</w:t>
+            </w:r>
+          </w:p>
+        </w:tc>
+      </w:tr>
+      <w:tr>
+        <w:tc>
+          <w:tcPr>
+            <w:tcW w:w="7465" w:type="dxa"/>
+          </w:tcPr>
+          <w:p>
+            <w:r>
+              <w:t>(g1 x1 y1)</w:t>
+            </w:r>
+          </w:p>
+        </w:tc>
+        <w:tc>
+          <w:tcPr>
+            <w:tcW w:w="1885" w:type="dxa"/>
+          </w:tcPr>
+          <w:p>
+            <w:r>
+              <w:t>T4</w:t>
+            </w:r>
+          </w:p>
+        </w:tc>
+      </w:tr>
+      <w:tr>
+        <w:tc>
+          <w:tcPr>
+            <w:tcW w:w="7465" w:type="dxa"/>
+          </w:tcPr>
+          <w:p>
+            <w:r>
+              <w:t>g1</w:t>
+            </w:r>
+          </w:p>
+        </w:tc>
+        <w:tc>
+          <w:tcPr>
+            <w:tcW w:w="1885" w:type="dxa"/>
+          </w:tcPr>
+          <w:p>
+            <w:proofErr w:type="spellStart"/>
+            <w:r>
+              <w:t>Tg</w:t>
+            </w:r>
+            <w:proofErr w:type="spellEnd"/>
+          </w:p>
+        </w:tc>
+      </w:tr>
+      <w:tr>
+        <w:tc>
+          <w:tcPr>
+            <w:tcW w:w="7465" w:type="dxa"/>
+          </w:tcPr>
+          <w:p>
+            <w:r>
+              <w:t>y1</w:t>
+            </w:r>
+          </w:p>
+        </w:tc>
+        <w:tc>
+          <w:tcPr>
+            <w:tcW w:w="1885" w:type="dxa"/>
+          </w:tcPr>
+          <w:p>
+            <w:r>
+              <w:t>Ty</w:t>
+            </w:r>
+          </w:p>
+        </w:tc>
+      </w:tr>
+      <w:tr>
+        <w:tc>
+          <w:tcPr>
+            <w:tcW w:w="7465" w:type="dxa"/>
+          </w:tcPr>
+          <w:p>
+            <w:r>
+              <w:t>x1</w:t>
+            </w:r>
+          </w:p>
+        </w:tc>
+        <w:tc>
+          <w:tcPr>
+            <w:tcW w:w="1885" w:type="dxa"/>
+          </w:tcPr>
+          <w:p>
+            <w:r>
+              <w:t>Tx</w:t>
+            </w:r>
+          </w:p>
+        </w:tc>
+      </w:tr>
+    </w:tbl>
+    <w:p/>
+    <w:p>
+      <w:r>
+        <w:rPr>
+          <w:b/>
+          <w:bCs/>
+        </w:rPr>
+        <w:t>Equations</w:t>
+      </w:r>
+      <w:r>
+        <w:t>:</w:t>
+      </w:r>
+    </w:p>
+    <w:p>
+      <w:r>
+        <w:t xml:space="preserve">T1 = </w:t>
+      </w:r>
+      <w:proofErr w:type="spellStart"/>
+      <w:r>
+        <w:t>Tf</w:t>
+      </w:r>
+      <w:proofErr w:type="spellEnd"/>
+      <w:r>
+        <w:t>*</w:t>
+      </w:r>
+      <w:proofErr w:type="spellStart"/>
+      <w:r>
+        <w:t>Tg</w:t>
+      </w:r>
+      <w:proofErr w:type="spellEnd"/>
+      <w:r>
+        <w:t>*Tx*Ty -&gt; T2</w:t>
+      </w:r>
+    </w:p>
+    <w:p>
+      <w:proofErr w:type="spellStart"/>
+      <w:r>
+        <w:t>Tf</w:t>
+      </w:r>
+      <w:proofErr w:type="spellEnd"/>
+      <w:r>
+        <w:t xml:space="preserve"> = T3*T</w:t>
+      </w:r>
+      <w:r>
+        <w:t>4</w:t>
+      </w:r>
+      <w:r>
+        <w:t xml:space="preserve"> -&gt; T2</w:t>
+      </w:r>
+    </w:p>
+    <w:p>
+      <w:proofErr w:type="spellStart"/>
+      <w:r>
+        <w:t>T</w:t>
+      </w:r>
+      <w:r>
+        <w:t>g</w:t>
+      </w:r>
+      <w:proofErr w:type="spellEnd"/>
+      <w:r>
+        <w:t xml:space="preserve"> = Ty*Tx -&gt; T3</w:t>
+      </w:r>
+    </w:p>
+    <w:p>
+      <w:proofErr w:type="spellStart"/>
+      <w:r>
+        <w:t>Tg</w:t>
+      </w:r>
+      <w:proofErr w:type="spellEnd"/>
+      <w:r>
+        <w:t xml:space="preserve"> = Tx*Ty -&gt; T4</w:t>
+      </w:r>
+    </w:p>
+    <w:p>
+      <w:pPr>
+        <w:rPr>
+          <w:b/>
+          <w:bCs/>
+          <w:rtl/>
+        </w:rPr>
+      </w:pPr>
+      <w:r>
+        <w:rPr>
+          <w:b/>
+          <w:bCs/>
+        </w:rPr>
+        <w:t>Inference success:</w:t>
+      </w:r>
+    </w:p>
+    <w:p>
+      <w:pPr>
+        <w:rPr>
+          <w:rFonts w:hint="cs"/>
+          <w:rtl/>
+        </w:rPr>
+      </w:pPr>
+      <w:r>
+        <w:t>T4 = T3</w:t>
+      </w:r>
+    </w:p>
+    <w:p>
+      <w:r>
+        <w:t>Ty = Tx</w:t>
+      </w:r>
+    </w:p>
+    <w:p>
+      <w:proofErr w:type="spellStart"/>
+      <w:r>
+        <w:t>Tg</w:t>
+      </w:r>
+      <w:proofErr w:type="spellEnd"/>
+      <w:r>
+        <w:t xml:space="preserve"> = Tx*Tx -&gt; T3</w:t>
+      </w:r>
+    </w:p>
+    <w:p>
+      <w:proofErr w:type="spellStart"/>
+      <w:r>
+        <w:t>Tf</w:t>
+      </w:r>
+      <w:proofErr w:type="spellEnd"/>
+      <w:r>
+        <w:t xml:space="preserve"> = T3*T3 -&gt; T2</w:t>
+      </w:r>
+    </w:p>
+    <w:p>
+      <w:r>
+        <w:t>T1 = [T3*T3 -&gt; T2]*[Tx*Tx -&gt; T3]*Tx*Tx -&gt; T2</w:t>
+      </w:r>
+    </w:p>
+    <w:p>
+      <w:r>
+        <w:t>(lambda (</w:t>
+      </w:r>
+      <w:r>
+        <w:rPr>
+          <w:b/>
+          <w:bCs/>
+        </w:rPr>
+        <w:t>[</w:t>
+      </w:r>
+      <w:r>
+        <w:t xml:space="preserve"> </w:t>
+      </w:r>
+      <w:r>
+        <w:rPr>
+          <w:color w:val="156082" w:themeColor="accent1"/>
+        </w:rPr>
+        <w:t>f1: [T3*T3 -&gt; T2]</w:t>
+      </w:r>
+      <w:r>
+        <w:t xml:space="preserve"> </w:t>
+      </w:r>
+      <w:r>
+        <w:rPr>
+          <w:color w:val="196B24" w:themeColor="accent3"/>
+          <w:shd w:val="clear" w:color="auto" w:fill="FFFFFF" w:themeFill="background1"/>
+        </w:rPr>
+        <w:t>[g1 : [Tx*Tx -&gt; T3]</w:t>
+      </w:r>
+      <w:r>
+        <w:rPr>
+          <w:shd w:val="clear" w:color="auto" w:fill="FFFFFF" w:themeFill="background1"/>
+        </w:rPr>
+        <w:t xml:space="preserve"> </w:t>
+      </w:r>
+      <w:r>
+        <w:rPr>
+          <w:color w:val="156082" w:themeColor="accent1"/>
+        </w:rPr>
+        <w:t>x1: [Tx]</w:t>
+      </w:r>
+      <w:r>
+        <w:t xml:space="preserve"> </w:t>
+      </w:r>
+      <w:r>
+        <w:rPr>
+          <w:color w:val="196B24" w:themeColor="accent3"/>
+        </w:rPr>
+        <w:t>y1: [Tx]</w:t>
+      </w:r>
+      <w:r>
+        <w:t xml:space="preserve"> </w:t>
+      </w:r>
+      <w:r>
+        <w:rPr>
+          <w:b/>
+          <w:bCs/>
+        </w:rPr>
+        <w:t>]</w:t>
+      </w:r>
+      <w:r>
+        <w:t xml:space="preserve">):  </w:t>
+      </w:r>
+      <w:r>
+        <w:t>T2</w:t>
+      </w:r>
+    </w:p>
+    <w:p/>
+    <w:p/>
+    <w:p/>
+    <w:p/>
+    <w:p/>
+    <w:p>
+      <w:pPr>
+        <w:pStyle w:val="Heading2"/>
+      </w:pPr>
+      <w:r>
+        <w:lastRenderedPageBreak/>
+        <w:t>Question 1.2.2</w:t>
+      </w:r>
+    </w:p>
+    <w:p/>
+    <w:p>
+      <w:r>
+        <w:rPr>
+          <w:b/>
+          <w:bCs/>
+        </w:rPr>
+        <w:t>Pool</w:t>
+      </w:r>
+      <w:r>
+        <w:t>:</w:t>
+      </w:r>
+    </w:p>
+    <w:tbl>
+      <w:tblPr>
+        <w:tblStyle w:val="TableGrid"/>
+        <w:tblW w:w="0" w:type="auto"/>
+        <w:tblLook w:val="04A0" w:firstRow="1" w:lastRow="0" w:firstColumn="1" w:lastColumn="0" w:noHBand="0" w:noVBand="1"/>
+      </w:tblPr>
+      <w:tblGrid>
+        <w:gridCol w:w="7465"/>
+        <w:gridCol w:w="1885"/>
+      </w:tblGrid>
+      <w:tr>
+        <w:tc>
+          <w:tcPr>
+            <w:tcW w:w="7465" w:type="dxa"/>
+            <w:shd w:val="clear" w:color="auto" w:fill="E8E8E8" w:themeFill="background2"/>
+          </w:tcPr>
+          <w:p>
+            <w:pPr>
+              <w:rPr>
+                <w:b/>
+                <w:bCs/>
+              </w:rPr>
+            </w:pPr>
+            <w:r>
+              <w:rPr>
+                <w:b/>
+                <w:bCs/>
+              </w:rPr>
+              <w:t>Sub-expression</w:t>
+            </w:r>
+          </w:p>
+        </w:tc>
+        <w:tc>
+          <w:tcPr>
+            <w:tcW w:w="1885" w:type="dxa"/>
+            <w:shd w:val="clear" w:color="auto" w:fill="E8E8E8" w:themeFill="background2"/>
+          </w:tcPr>
+          <w:p>
+            <w:pPr>
+              <w:rPr>
+                <w:b/>
+                <w:bCs/>
+              </w:rPr>
+            </w:pPr>
+            <w:r>
+              <w:rPr>
+                <w:b/>
+                <w:bCs/>
+              </w:rPr>
+              <w:t>type</w:t>
+            </w:r>
+          </w:p>
+        </w:tc>
+      </w:tr>
+      <w:tr>
+        <w:tc>
+          <w:tcPr>
+            <w:tcW w:w="7465" w:type="dxa"/>
+          </w:tcPr>
+          <w:p>
+            <w:r>
+              <w:t>((lambda (f1) (lambda (x1) (f1 x1 x1))) (lambda (y1) y1))</w:t>
+            </w:r>
+          </w:p>
+        </w:tc>
+        <w:tc>
+          <w:tcPr>
+            <w:tcW w:w="1885" w:type="dxa"/>
+          </w:tcPr>
+          <w:p>
+            <w:r>
+              <w:t>T1</w:t>
+            </w:r>
+          </w:p>
+        </w:tc>
+      </w:tr>
+      <w:tr>
+        <w:tc>
+          <w:tcPr>
+            <w:tcW w:w="7465" w:type="dxa"/>
+          </w:tcPr>
+          <w:p>
+            <w:r>
+              <w:t>(lambda (f1) (lambda (x1) (f1 x1 x1)))</w:t>
+            </w:r>
+          </w:p>
+        </w:tc>
+        <w:tc>
+          <w:tcPr>
+            <w:tcW w:w="1885" w:type="dxa"/>
+          </w:tcPr>
+          <w:p>
+            <w:r>
+              <w:t>T2</w:t>
+            </w:r>
+          </w:p>
+        </w:tc>
+      </w:tr>
+      <w:tr>
+        <w:tc>
+          <w:tcPr>
+            <w:tcW w:w="7465" w:type="dxa"/>
+          </w:tcPr>
+          <w:p>
+            <w:r>
+              <w:t>f1</w:t>
+            </w:r>
+          </w:p>
+        </w:tc>
+        <w:tc>
+          <w:tcPr>
+            <w:tcW w:w="1885" w:type="dxa"/>
+          </w:tcPr>
+          <w:p>
+            <w:proofErr w:type="spellStart"/>
+            <w:r>
+              <w:t>Tf</w:t>
+            </w:r>
+            <w:proofErr w:type="spellEnd"/>
+          </w:p>
+        </w:tc>
+      </w:tr>
+      <w:tr>
+        <w:tc>
+          <w:tcPr>
+            <w:tcW w:w="7465" w:type="dxa"/>
+          </w:tcPr>
+          <w:p>
+            <w:r>
+              <w:t>(lambda (x1) (f1 x1 x1))</w:t>
+            </w:r>
+          </w:p>
+        </w:tc>
+        <w:tc>
+          <w:tcPr>
+            <w:tcW w:w="1885" w:type="dxa"/>
+          </w:tcPr>
+          <w:p>
+            <w:r>
+              <w:t>T3</w:t>
+            </w:r>
+          </w:p>
+        </w:tc>
+      </w:tr>
+      <w:tr>
+        <w:tc>
+          <w:tcPr>
+            <w:tcW w:w="7465" w:type="dxa"/>
+          </w:tcPr>
+          <w:p>
+            <w:r>
+              <w:t>x1</w:t>
+            </w:r>
+          </w:p>
+        </w:tc>
+        <w:tc>
+          <w:tcPr>
+            <w:tcW w:w="1885" w:type="dxa"/>
+          </w:tcPr>
+          <w:p>
+            <w:r>
+              <w:t>Tx</w:t>
+            </w:r>
+          </w:p>
+        </w:tc>
+      </w:tr>
+      <w:tr>
+        <w:tc>
+          <w:tcPr>
+            <w:tcW w:w="7465" w:type="dxa"/>
+          </w:tcPr>
+          <w:p>
+            <w:r>
+              <w:t>(f1 x1 x1)</w:t>
+            </w:r>
+          </w:p>
+        </w:tc>
+        <w:tc>
+          <w:tcPr>
+            <w:tcW w:w="1885" w:type="dxa"/>
+          </w:tcPr>
+          <w:p>
+            <w:r>
+              <w:t>T4</w:t>
+            </w:r>
+          </w:p>
+        </w:tc>
+      </w:tr>
+      <w:tr>
+        <w:tc>
+          <w:tcPr>
+            <w:tcW w:w="7465" w:type="dxa"/>
+          </w:tcPr>
+          <w:p>
+            <w:pPr>
+              <w:rPr>
+                <w:rtl/>
+              </w:rPr>
+            </w:pPr>
+            <w:r>
+              <w:t>(lambda (y1) y1)</w:t>
+            </w:r>
+          </w:p>
+        </w:tc>
+        <w:tc>
+          <w:tcPr>
+            <w:tcW w:w="1885" w:type="dxa"/>
+          </w:tcPr>
+          <w:p>
+            <w:r>
+              <w:t>T</w:t>
+            </w:r>
+            <w:r>
+              <w:rPr>
+                <w:rFonts w:hint="cs"/>
+                <w:rtl/>
+              </w:rPr>
+              <w:t>5</w:t>
+            </w:r>
+          </w:p>
+        </w:tc>
+      </w:tr>
+      <w:tr>
+        <w:tc>
+          <w:tcPr>
+            <w:tcW w:w="7465" w:type="dxa"/>
+          </w:tcPr>
+          <w:p>
+            <w:r>
+              <w:t>y1</w:t>
+            </w:r>
+          </w:p>
+        </w:tc>
+        <w:tc>
+          <w:tcPr>
+            <w:tcW w:w="1885" w:type="dxa"/>
+          </w:tcPr>
+          <w:p>
+            <w:r>
+              <w:t>Ty</w:t>
+            </w:r>
+          </w:p>
+        </w:tc>
+      </w:tr>
+      <w:tr>
+        <w:tc>
+          <w:tcPr>
+            <w:tcW w:w="7465" w:type="dxa"/>
+          </w:tcPr>
+          <w:p/>
+        </w:tc>
+        <w:tc>
+          <w:tcPr>
+            <w:tcW w:w="1885" w:type="dxa"/>
+          </w:tcPr>
+          <w:p/>
+        </w:tc>
+      </w:tr>
+      <w:tr>
+        <w:tc>
+          <w:tcPr>
+            <w:tcW w:w="7465" w:type="dxa"/>
+          </w:tcPr>
+          <w:p/>
+        </w:tc>
+        <w:tc>
+          <w:tcPr>
+            <w:tcW w:w="1885" w:type="dxa"/>
+          </w:tcPr>
+          <w:p/>
+        </w:tc>
+      </w:tr>
+      <w:tr>
+        <w:tc>
+          <w:tcPr>
+            <w:tcW w:w="7465" w:type="dxa"/>
+          </w:tcPr>
+          <w:p/>
+        </w:tc>
+        <w:tc>
+          <w:tcPr>
+            <w:tcW w:w="1885" w:type="dxa"/>
+          </w:tcPr>
+          <w:p/>
+        </w:tc>
+      </w:tr>
+      <w:tr>
+        <w:tc>
+          <w:tcPr>
+            <w:tcW w:w="7465" w:type="dxa"/>
+          </w:tcPr>
+          <w:p/>
+        </w:tc>
+        <w:tc>
+          <w:tcPr>
+            <w:tcW w:w="1885" w:type="dxa"/>
+          </w:tcPr>
+          <w:p/>
+        </w:tc>
+      </w:tr>
+    </w:tbl>
+    <w:p/>
+    <w:p>
+      <w:pPr>
+        <w:rPr>
+          <w:rFonts w:hint="cs"/>
+          <w:rtl/>
+        </w:rPr>
+      </w:pPr>
+    </w:p>
+    <w:p/>
+    <w:p/>
+    <w:p/>
+    <w:p/>
+    <w:p/>
+    <w:p/>
+    <w:p/>
+    <w:p/>
+    <w:p/>
+    <w:p/>
+    <w:p/>
+    <w:p/>
+    <w:p/>
+    <w:p/>
+    <w:p/>
+    <w:p/>
+    <w:p/>
+    <w:p>
+      <w:pPr>
+        <w:pStyle w:val="Heading2"/>
+      </w:pPr>
+      <w:r>
+        <w:t>Question 1.2.3</w:t>
+      </w:r>
+    </w:p>
+    <w:tbl>
+      <w:tblPr>
+        <w:tblStyle w:val="TableGrid"/>
+        <w:tblW w:w="0" w:type="auto"/>
+        <w:tblLook w:val="04A0" w:firstRow="1" w:lastRow="0" w:firstColumn="1" w:lastColumn="0" w:noHBand="0" w:noVBand="1"/>
+      </w:tblPr>
+      <w:tblGrid>
+        <w:gridCol w:w="7465"/>
+        <w:gridCol w:w="1885"/>
+      </w:tblGrid>
+      <w:tr>
+        <w:tc>
+          <w:tcPr>
+            <w:tcW w:w="7465" w:type="dxa"/>
+            <w:shd w:val="clear" w:color="auto" w:fill="E8E8E8" w:themeFill="background2"/>
+          </w:tcPr>
+          <w:p>
+            <w:pPr>
+              <w:rPr>
+                <w:b/>
+                <w:bCs/>
+              </w:rPr>
+            </w:pPr>
+            <w:r>
+              <w:rPr>
+                <w:b/>
+                <w:bCs/>
+              </w:rPr>
+              <w:t>Sub-expression</w:t>
+            </w:r>
+          </w:p>
+        </w:tc>
+        <w:tc>
+          <w:tcPr>
+            <w:tcW w:w="1885" w:type="dxa"/>
+            <w:shd w:val="clear" w:color="auto" w:fill="E8E8E8" w:themeFill="background2"/>
+          </w:tcPr>
+          <w:p>
+            <w:pPr>
+              <w:rPr>
+                <w:b/>
+                <w:bCs/>
+              </w:rPr>
+            </w:pPr>
+            <w:r>
+              <w:rPr>
+                <w:b/>
+                <w:bCs/>
+              </w:rPr>
+              <w:t>type</w:t>
+            </w:r>
+          </w:p>
+        </w:tc>
+      </w:tr>
+      <w:tr>
+        <w:tc>
+          <w:tcPr>
+            <w:tcW w:w="7465" w:type="dxa"/>
+          </w:tcPr>
+          <w:p/>
+        </w:tc>
+        <w:tc>
+          <w:tcPr>
+            <w:tcW w:w="1885" w:type="dxa"/>
+          </w:tcPr>
+          <w:p/>
+        </w:tc>
+      </w:tr>
+      <w:tr>
+        <w:tc>
+          <w:tcPr>
+            <w:tcW w:w="7465" w:type="dxa"/>
+          </w:tcPr>
+          <w:p/>
+        </w:tc>
+        <w:tc>
+          <w:tcPr>
+            <w:tcW w:w="1885" w:type="dxa"/>
+          </w:tcPr>
+          <w:p/>
+        </w:tc>
+      </w:tr>
+      <w:tr>
+        <w:tc>
+          <w:tcPr>
+            <w:tcW w:w="7465" w:type="dxa"/>
+          </w:tcPr>
+          <w:p/>
+        </w:tc>
+        <w:tc>
+          <w:tcPr>
+            <w:tcW w:w="1885" w:type="dxa"/>
+          </w:tcPr>
+          <w:p/>
+        </w:tc>
+      </w:tr>
+      <w:tr>
+        <w:tc>
+          <w:tcPr>
+            <w:tcW w:w="7465" w:type="dxa"/>
+          </w:tcPr>
+          <w:p/>
+        </w:tc>
+        <w:tc>
+          <w:tcPr>
+            <w:tcW w:w="1885" w:type="dxa"/>
+          </w:tcPr>
+          <w:p/>
+        </w:tc>
+      </w:tr>
+      <w:tr>
+        <w:tc>
+          <w:tcPr>
+            <w:tcW w:w="7465" w:type="dxa"/>
+          </w:tcPr>
+          <w:p/>
+        </w:tc>
+        <w:tc>
+          <w:tcPr>
+            <w:tcW w:w="1885" w:type="dxa"/>
+          </w:tcPr>
+          <w:p/>
+        </w:tc>
+      </w:tr>
+      <w:tr>
+        <w:tc>
+          <w:tcPr>
+            <w:tcW w:w="7465" w:type="dxa"/>
+          </w:tcPr>
+          <w:p/>
+        </w:tc>
+        <w:tc>
+          <w:tcPr>
+            <w:tcW w:w="1885" w:type="dxa"/>
+          </w:tcPr>
+          <w:p/>
+        </w:tc>
+      </w:tr>
+      <w:tr>
+        <w:tc>
+          <w:tcPr>
+            <w:tcW w:w="7465" w:type="dxa"/>
+          </w:tcPr>
+          <w:p/>
+        </w:tc>
+        <w:tc>
+          <w:tcPr>
+            <w:tcW w:w="1885" w:type="dxa"/>
+          </w:tcPr>
+          <w:p/>
+        </w:tc>
+      </w:tr>
+      <w:tr>
+        <w:tc>
+          <w:tcPr>
+            <w:tcW w:w="7465" w:type="dxa"/>
+          </w:tcPr>
+          <w:p/>
+        </w:tc>
+        <w:tc>
+          <w:tcPr>
+            <w:tcW w:w="1885" w:type="dxa"/>
+          </w:tcPr>
+          <w:p/>
+        </w:tc>
+      </w:tr>
+    </w:tbl>
+    <w:p>
+      <w:pPr>
+        <w:rPr>
+          <w:rtl/>
+        </w:rPr>
+      </w:pPr>
+    </w:p>
     <w:sectPr>
       <w:pgSz w:w="12240" w:h="15840"/>
       <w:pgMar w:top="1440" w:right="1440" w:bottom="1440" w:left="1440" w:header="720" w:footer="720" w:gutter="0"/>
@@ -692,7 +1708,6 @@
   <w:style w:type="character" w:default="1" w:styleId="DefaultParagraphFont">
     <w:name w:val="Default Paragraph Font"/>
     <w:uiPriority w:val="1"/>
-    <w:semiHidden/>
     <w:unhideWhenUsed/>
   </w:style>
   <w:style w:type="table" w:default="1" w:styleId="TableNormal">
@@ -1004,6 +2019,25 @@
       <w:color w:val="0F4761" w:themeColor="accent1" w:themeShade="BF"/>
       <w:spacing w:val="5"/>
     </w:rPr>
+  </w:style>
+  <w:style w:type="table" w:styleId="TableGrid">
+    <w:name w:val="Table Grid"/>
+    <w:basedOn w:val="TableNormal"/>
+    <w:uiPriority w:val="39"/>
+    <w:rsid w:val="0060468A"/>
+    <w:pPr>
+      <w:spacing w:after="0" w:line="240" w:lineRule="auto"/>
+    </w:pPr>
+    <w:tblPr>
+      <w:tblBorders>
+        <w:top w:val="single" w:sz="4" w:space="0" w:color="auto"/>
+        <w:left w:val="single" w:sz="4" w:space="0" w:color="auto"/>
+        <w:bottom w:val="single" w:sz="4" w:space="0" w:color="auto"/>
+        <w:right w:val="single" w:sz="4" w:space="0" w:color="auto"/>
+        <w:insideH w:val="single" w:sz="4" w:space="0" w:color="auto"/>
+        <w:insideV w:val="single" w:sz="4" w:space="0" w:color="auto"/>
+      </w:tblBorders>
+    </w:tblPr>
   </w:style>
 </w:styles>
 </file>

</xml_diff>

<commit_message>
Finished 1.2.3 and maybe fixed test file
</commit_message>
<xml_diff>
--- a/Part1.docx
+++ b/Part1.docx
@@ -29,13 +29,8 @@
         <w:t>, g is from T1 to T2</w:t>
       </w:r>
       <w:r>
-        <w:t xml:space="preserve"> in the </w:t>
-      </w:r>
-      <w:proofErr w:type="spellStart"/>
-      <w:r>
-        <w:t>Tenv</w:t>
-      </w:r>
-      <w:proofErr w:type="spellEnd"/>
+        <w:t xml:space="preserve"> in the Tenv</w:t>
+      </w:r>
       <w:r>
         <w:t xml:space="preserve">, after executing (g a) we get T2. </w:t>
       </w:r>
@@ -241,11 +236,9 @@
             <w:tcW w:w="1885" w:type="dxa"/>
           </w:tcPr>
           <w:p>
-            <w:proofErr w:type="spellStart"/>
             <w:r>
               <w:t>Tf</w:t>
             </w:r>
-            <w:proofErr w:type="spellEnd"/>
           </w:p>
         </w:tc>
       </w:tr>
@@ -309,11 +302,9 @@
             <w:tcW w:w="1885" w:type="dxa"/>
           </w:tcPr>
           <w:p>
-            <w:proofErr w:type="spellStart"/>
             <w:r>
               <w:t>Tg</w:t>
             </w:r>
-            <w:proofErr w:type="spellEnd"/>
           </w:p>
         </w:tc>
       </w:tr>
@@ -377,33 +368,12 @@
     </w:p>
     <w:p>
       <w:r>
-        <w:t xml:space="preserve">T1 = </w:t>
-      </w:r>
-      <w:proofErr w:type="spellStart"/>
-      <w:r>
-        <w:t>Tf</w:t>
-      </w:r>
-      <w:proofErr w:type="spellEnd"/>
-      <w:r>
-        <w:t>*</w:t>
-      </w:r>
-      <w:proofErr w:type="spellStart"/>
-      <w:r>
-        <w:t>Tg</w:t>
-      </w:r>
-      <w:proofErr w:type="spellEnd"/>
-      <w:r>
-        <w:t>*Tx*Ty -&gt; T2</w:t>
-      </w:r>
-    </w:p>
-    <w:p>
-      <w:proofErr w:type="spellStart"/>
-      <w:r>
-        <w:t>Tf</w:t>
-      </w:r>
-      <w:proofErr w:type="spellEnd"/>
-      <w:r>
-        <w:t xml:space="preserve"> = T3*T</w:t>
+        <w:t>T1 = Tf*Tg*Tx*Ty -&gt; T2</w:t>
+      </w:r>
+    </w:p>
+    <w:p>
+      <w:r>
+        <w:t>Tf = T3*T</w:t>
       </w:r>
       <w:r>
         <w:t>4</w:t>
@@ -413,26 +383,16 @@
       </w:r>
     </w:p>
     <w:p>
-      <w:proofErr w:type="spellStart"/>
       <w:r>
         <w:t>T</w:t>
       </w:r>
       <w:r>
-        <w:t>g</w:t>
-      </w:r>
-      <w:proofErr w:type="spellEnd"/>
-      <w:r>
-        <w:t xml:space="preserve"> = Ty*Tx -&gt; T3</w:t>
-      </w:r>
-    </w:p>
-    <w:p>
-      <w:proofErr w:type="spellStart"/>
-      <w:r>
-        <w:t>Tg</w:t>
-      </w:r>
-      <w:proofErr w:type="spellEnd"/>
-      <w:r>
-        <w:t xml:space="preserve"> = Tx*Ty -&gt; T4</w:t>
+        <w:t>g = Ty*Tx -&gt; T3</w:t>
+      </w:r>
+    </w:p>
+    <w:p>
+      <w:r>
+        <w:t>Tg = Tx*Ty -&gt; T4</w:t>
       </w:r>
     </w:p>
     <w:p>
@@ -467,23 +427,13 @@
       </w:r>
     </w:p>
     <w:p>
-      <w:proofErr w:type="spellStart"/>
-      <w:r>
-        <w:t>Tg</w:t>
-      </w:r>
-      <w:proofErr w:type="spellEnd"/>
-      <w:r>
-        <w:t xml:space="preserve"> = Tx*Tx -&gt; T3</w:t>
-      </w:r>
-    </w:p>
-    <w:p>
-      <w:proofErr w:type="spellStart"/>
-      <w:r>
-        <w:t>Tf</w:t>
-      </w:r>
-      <w:proofErr w:type="spellEnd"/>
-      <w:r>
-        <w:t xml:space="preserve"> = T3*T3 -&gt; T2</w:t>
+      <w:r>
+        <w:t>Tg = Tx*Tx -&gt; T3</w:t>
+      </w:r>
+    </w:p>
+    <w:p>
+      <w:r>
+        <w:t>Tf = T3*T3 -&gt; T2</w:t>
       </w:r>
     </w:p>
     <w:p>
@@ -711,11 +661,9 @@
             <w:tcW w:w="1876" w:type="dxa"/>
           </w:tcPr>
           <w:p>
-            <w:proofErr w:type="spellStart"/>
             <w:r>
               <w:t>Tf</w:t>
             </w:r>
-            <w:proofErr w:type="spellEnd"/>
           </w:p>
         </w:tc>
       </w:tr>
@@ -882,15 +830,7 @@
     </w:p>
     <w:p>
       <w:r>
-        <w:t xml:space="preserve">T2 = </w:t>
-      </w:r>
-      <w:proofErr w:type="spellStart"/>
-      <w:r>
-        <w:t>Tf</w:t>
-      </w:r>
-      <w:proofErr w:type="spellEnd"/>
-      <w:r>
-        <w:t xml:space="preserve"> -&gt; T3</w:t>
+        <w:t>T2 = Tf -&gt; T3</w:t>
       </w:r>
     </w:p>
     <w:p>
@@ -899,13 +839,8 @@
       </w:r>
     </w:p>
     <w:p>
-      <w:proofErr w:type="spellStart"/>
-      <w:r>
-        <w:t>Tf</w:t>
-      </w:r>
-      <w:proofErr w:type="spellEnd"/>
-      <w:r>
-        <w:t xml:space="preserve"> = Tx*Tx -&gt; T4</w:t>
+      <w:r>
+        <w:t>Tf = Tx*Tx -&gt; T4</w:t>
       </w:r>
     </w:p>
     <w:p>
@@ -936,27 +871,13 @@
       </w:r>
     </w:p>
     <w:p>
-      <w:proofErr w:type="spellStart"/>
-      <w:r>
-        <w:t>Tf</w:t>
-      </w:r>
-      <w:proofErr w:type="spellEnd"/>
-      <w:r>
-        <w:t xml:space="preserve"> can’t equal T5 because </w:t>
-      </w:r>
-      <w:proofErr w:type="spellStart"/>
-      <w:r>
-        <w:t>Tf</w:t>
-      </w:r>
-      <w:proofErr w:type="spellEnd"/>
-      <w:r>
-        <w:t xml:space="preserve"> expects two arguments of type Tx while T5 expects one argument of type Ty.</w:t>
+      <w:r>
+        <w:t>Tf can’t equal T5 because Tf expects two arguments of type Tx while T5 expects one argument of type Ty.</w:t>
       </w:r>
     </w:p>
     <w:p>
       <w:pPr>
         <w:rPr>
-          <w:rFonts w:hint="cs"/>
           <w:rtl/>
         </w:rPr>
       </w:pPr>
@@ -971,9 +892,25 @@
       <w:pPr>
         <w:pStyle w:val="Heading2"/>
       </w:pPr>
-      <w:r>
-        <w:lastRenderedPageBreak/>
+    </w:p>
+    <w:p>
+      <w:pPr>
+        <w:pStyle w:val="Heading2"/>
+      </w:pPr>
+      <w:r>
         <w:t>Question 1.2.3</w:t>
+      </w:r>
+    </w:p>
+    <w:p>
+      <w:r>
+        <w:rPr>
+          <w:b/>
+          <w:bCs/>
+        </w:rPr>
+        <w:t>Pool</w:t>
+      </w:r>
+      <w:r>
+        <w:t>:</w:t>
       </w:r>
     </w:p>
     <w:tbl>
@@ -1035,13 +972,21 @@
           <w:tcPr>
             <w:tcW w:w="7465" w:type="dxa"/>
           </w:tcPr>
-          <w:p/>
+          <w:p>
+            <w:r>
+              <w:t>((lambda (f1) (lambda (x1) ((f1 x1) x1))) (lambda (y1) y1))</w:t>
+            </w:r>
+          </w:p>
         </w:tc>
         <w:tc>
           <w:tcPr>
             <w:tcW w:w="1885" w:type="dxa"/>
           </w:tcPr>
-          <w:p/>
+          <w:p>
+            <w:r>
+              <w:t>T1</w:t>
+            </w:r>
+          </w:p>
         </w:tc>
       </w:tr>
       <w:tr>
@@ -1049,13 +994,21 @@
           <w:tcPr>
             <w:tcW w:w="7465" w:type="dxa"/>
           </w:tcPr>
-          <w:p/>
+          <w:p>
+            <w:r>
+              <w:t>(lambda (f1) (lambda (x1) ((f1 x1) x1)))</w:t>
+            </w:r>
+          </w:p>
         </w:tc>
         <w:tc>
           <w:tcPr>
             <w:tcW w:w="1885" w:type="dxa"/>
           </w:tcPr>
-          <w:p/>
+          <w:p>
+            <w:r>
+              <w:t>T2</w:t>
+            </w:r>
+          </w:p>
         </w:tc>
       </w:tr>
       <w:tr>
@@ -1063,13 +1016,21 @@
           <w:tcPr>
             <w:tcW w:w="7465" w:type="dxa"/>
           </w:tcPr>
-          <w:p/>
+          <w:p>
+            <w:r>
+              <w:t>f1</w:t>
+            </w:r>
+          </w:p>
         </w:tc>
         <w:tc>
           <w:tcPr>
             <w:tcW w:w="1885" w:type="dxa"/>
           </w:tcPr>
-          <w:p/>
+          <w:p>
+            <w:r>
+              <w:t>Tf</w:t>
+            </w:r>
+          </w:p>
         </w:tc>
       </w:tr>
       <w:tr>
@@ -1077,13 +1038,21 @@
           <w:tcPr>
             <w:tcW w:w="7465" w:type="dxa"/>
           </w:tcPr>
-          <w:p/>
+          <w:p>
+            <w:r>
+              <w:t>(lambda (x1) ((f1 x1) x1))</w:t>
+            </w:r>
+          </w:p>
         </w:tc>
         <w:tc>
           <w:tcPr>
             <w:tcW w:w="1885" w:type="dxa"/>
           </w:tcPr>
-          <w:p/>
+          <w:p>
+            <w:r>
+              <w:t>T3</w:t>
+            </w:r>
+          </w:p>
         </w:tc>
       </w:tr>
       <w:tr>
@@ -1091,13 +1060,21 @@
           <w:tcPr>
             <w:tcW w:w="7465" w:type="dxa"/>
           </w:tcPr>
-          <w:p/>
+          <w:p>
+            <w:r>
+              <w:t>x1</w:t>
+            </w:r>
+          </w:p>
         </w:tc>
         <w:tc>
           <w:tcPr>
             <w:tcW w:w="1885" w:type="dxa"/>
           </w:tcPr>
-          <w:p/>
+          <w:p>
+            <w:r>
+              <w:t>Tx</w:t>
+            </w:r>
+          </w:p>
         </w:tc>
       </w:tr>
       <w:tr>
@@ -1105,13 +1082,21 @@
           <w:tcPr>
             <w:tcW w:w="7465" w:type="dxa"/>
           </w:tcPr>
-          <w:p/>
+          <w:p>
+            <w:r>
+              <w:t>((f1 x1) x1)</w:t>
+            </w:r>
+          </w:p>
         </w:tc>
         <w:tc>
           <w:tcPr>
             <w:tcW w:w="1885" w:type="dxa"/>
           </w:tcPr>
-          <w:p/>
+          <w:p>
+            <w:r>
+              <w:t>T4</w:t>
+            </w:r>
+          </w:p>
         </w:tc>
       </w:tr>
       <w:tr>
@@ -1119,13 +1104,21 @@
           <w:tcPr>
             <w:tcW w:w="7465" w:type="dxa"/>
           </w:tcPr>
-          <w:p/>
+          <w:p>
+            <w:r>
+              <w:t>(f1 x1)</w:t>
+            </w:r>
+          </w:p>
         </w:tc>
         <w:tc>
           <w:tcPr>
             <w:tcW w:w="1885" w:type="dxa"/>
           </w:tcPr>
-          <w:p/>
+          <w:p>
+            <w:r>
+              <w:t>T5</w:t>
+            </w:r>
+          </w:p>
         </w:tc>
       </w:tr>
       <w:tr>
@@ -1133,16 +1126,124 @@
           <w:tcPr>
             <w:tcW w:w="7465" w:type="dxa"/>
           </w:tcPr>
-          <w:p/>
+          <w:p>
+            <w:r>
+              <w:t>(lambda (y1) y1)</w:t>
+            </w:r>
+          </w:p>
         </w:tc>
         <w:tc>
           <w:tcPr>
             <w:tcW w:w="1885" w:type="dxa"/>
           </w:tcPr>
-          <w:p/>
+          <w:p>
+            <w:r>
+              <w:t>T6</w:t>
+            </w:r>
+          </w:p>
+        </w:tc>
+      </w:tr>
+      <w:tr>
+        <w:tc>
+          <w:tcPr>
+            <w:tcW w:w="7465" w:type="dxa"/>
+          </w:tcPr>
+          <w:p>
+            <w:r>
+              <w:t>y1</w:t>
+            </w:r>
+          </w:p>
+        </w:tc>
+        <w:tc>
+          <w:tcPr>
+            <w:tcW w:w="1885" w:type="dxa"/>
+          </w:tcPr>
+          <w:p>
+            <w:r>
+              <w:t>Ty</w:t>
+            </w:r>
+          </w:p>
         </w:tc>
       </w:tr>
     </w:tbl>
+    <w:p/>
+    <w:p>
+      <w:r>
+        <w:rPr>
+          <w:b/>
+          <w:bCs/>
+        </w:rPr>
+        <w:t>Equations</w:t>
+      </w:r>
+      <w:r>
+        <w:t>:</w:t>
+      </w:r>
+    </w:p>
+    <w:p>
+      <w:r>
+        <w:t>T2 = T6 -&gt; T1</w:t>
+      </w:r>
+    </w:p>
+    <w:p>
+      <w:r>
+        <w:t>T2 = Tf -&gt; T3</w:t>
+      </w:r>
+    </w:p>
+    <w:p>
+      <w:r>
+        <w:t xml:space="preserve">T3 = Tx -&gt; </w:t>
+      </w:r>
+      <w:r>
+        <w:t xml:space="preserve"> </w:t>
+      </w:r>
+      <w:r>
+        <w:t>T4</w:t>
+      </w:r>
+    </w:p>
+    <w:p>
+      <w:r>
+        <w:t>T5 = Tx -&gt; T4</w:t>
+      </w:r>
+    </w:p>
+    <w:p>
+      <w:r>
+        <w:t>Tf = Tx -&gt; T5</w:t>
+      </w:r>
+    </w:p>
+    <w:p>
+      <w:r>
+        <w:t>T6 = Ty -&gt; Ty</w:t>
+      </w:r>
+    </w:p>
+    <w:p/>
+    <w:p>
+      <w:r>
+        <w:rPr>
+          <w:b/>
+          <w:bCs/>
+        </w:rPr>
+        <w:t>Inference</w:t>
+      </w:r>
+      <w:r>
+        <w:rPr>
+          <w:b/>
+          <w:bCs/>
+        </w:rPr>
+        <w:t xml:space="preserve"> Failure:</w:t>
+      </w:r>
+    </w:p>
+    <w:p>
+      <w:r>
+        <w:t>Ty = Ty -&gt; T4</w:t>
+      </w:r>
+    </w:p>
+    <w:p>
+      <w:r>
+        <w:t>We were taught in class that there is a constraint that the equations must follow, that a type can’t be defined with itself being in the definition. Because at the end we get Ty that is defined by itself, the Inference fails.</w:t>
+      </w:r>
+    </w:p>
+    <w:p/>
+    <w:p/>
     <w:p>
       <w:pPr>
         <w:rPr>
@@ -1762,7 +1863,6 @@
   <w:style w:type="character" w:default="1" w:styleId="DefaultParagraphFont">
     <w:name w:val="Default Paragraph Font"/>
     <w:uiPriority w:val="1"/>
-    <w:semiHidden/>
     <w:unhideWhenUsed/>
   </w:style>
   <w:style w:type="table" w:default="1" w:styleId="TableNormal">

</xml_diff>